<commit_message>
incorpora correcciones  y cierre metodológico
Actualiza metodología, arquitectura, manuales, matriz de validación, roadmap y registro de cambios. Se explica con mayor detalle qué se hizo, cómo, por qué y para qué en cada etapa del proyecto.
</commit_message>
<xml_diff>
--- a/docs/Manual_Pipeline_EPH.docx
+++ b/docs/Manual_Pipeline_EPH.docx
@@ -95,7 +95,7 @@
           </w:p>
           <w:p>
             <w:r>
-              <w:t>Versión 3.2.1 · 24/09/2026</w:t>
+              <w:t>Producto 3.4.0 · Motor ETL 3.2.1 · 14/10/2026</w:t>
             </w:r>
           </w:p>
         </w:tc>
@@ -315,6 +315,11 @@
           <w:szCs w:val="22"/>
         </w:rPr>
         <w:t xml:space="preserve">Solo se hace una vez en la computadora donde se vaya a usar el pipeline.</w:t>
+      </w:r>
+    </w:p>
+    <w:p>
+      <w:r>
+        <w:t>Entorno operativo: el pipeline se ejecuta con Python local desde una terminal ubicada en la raíz del repositorio. Las dependencias se instalan previamente desde requirements.txt; ningún bloque del pipeline o del EDA ejecuta pip install durante su funcionamiento. El notebook se conserva como material demostrativo y no reemplaza el flujo ETL.</w:t>
       </w:r>
     </w:p>
     <w:p>
@@ -671,7 +676,7 @@
                       <w:sz w:val="19"/>
                       <w:szCs w:val="19"/>
                     </w:rPr>
-                    <w:t xml:space="preserve">pip install pandas requests openpyxl</w:t>
+                    <w:t xml:space="preserve">python -m pip install -r requirements.txt</w:t>
                   </w:r>
                 </w:p>
               </w:tc>
@@ -4067,7 +4072,7 @@
           </w:tcPr>
           <w:p>
             <w:r>
-              <w:t>Si se cambia algo en el código, ejecutar python -m pytest tests -q antes de actualizar el histórico. En v3.2.1 la suite esperada es 68 passed.</w:t>
+              <w:t>Si se cambia algo en el código, ejecutar python -m pytest tests -q antes de actualizar el histórico. En el cierre V3.4.0 la suite esperada es 97 passed; la validación externa registra 27/27 concordancias contra INDEC.</w:t>
             </w:r>
           </w:p>
         </w:tc>
@@ -4198,12 +4203,7 @@
         <w:jc w:val="both"/>
       </w:pPr>
       <w:r>
-        <w:rPr>
-          <w:rFonts w:ascii="Arial" w:hAnsi="Arial" w:eastAsia="Arial"/>
-          <w:color w:val="333333"/>
-          <w:sz w:val="22"/>
-        </w:rPr>
-        <w:t>El dashboard se inicia desde la raíz con: python -m streamlit run notebooks/app.py. Puede funcionar sólo con data_snapshot, sin ZIP ni microdatos individuales.</w:t>
+        <w:t>El dashboard se inicia desde la raíz con: python -m streamlit run portal/app.py. El portal consume salidas agregadas validadas y puede funcionar con data_snapshot, sin cargar ZIP ni microdatos individuales.</w:t>
       </w:r>
     </w:p>
     <w:p>
@@ -4377,20 +4377,6 @@
           <w:sz w:val="22"/>
         </w:rPr>
         <w:t>Desde v3.2.1, procesar_lote() omite períodos FUTURO no registrados. Por eso --todos o --anio 2026 no intentan descargar automáticamente un trimestre que todavía no corresponde.</w:t>
-      </w:r>
-    </w:p>
-    <w:p>
-      <w:pPr>
-        <w:spacing w:after="40" w:before="0" w:line="269" w:lineRule="auto"/>
-        <w:jc w:val="both"/>
-      </w:pPr>
-      <w:r>
-        <w:rPr>
-          <w:rFonts w:ascii="Arial" w:hAnsi="Arial" w:eastAsia="Arial"/>
-          <w:color w:val="333333"/>
-          <w:sz w:val="22"/>
-        </w:rPr>
-        <w:t>Validación de la versión: 68 pruebas automatizadas aprobadas. La prueba manual local confirmó el histórico hasta 2026T1, el monitor, la prevalidación, el portal y la administración con escritura final bloqueada.</w:t>
       </w:r>
     </w:p>
     <w:sectPr>

</xml_diff>